<commit_message>
fix: update To Trinh template to strict VN administrative format
</commit_message>
<xml_diff>
--- a/webapp/templates/ToTrinh_Template.docx
+++ b/webapp/templates/ToTrinh_Template.docx
@@ -6,23 +6,26 @@
       <w:tblPr>
         <w:tblW w:type="auto" w:w="0"/>
         <w:jc w:val="center"/>
+        <w:tblLayout w:type="fixed"/>
         <w:tblLook w:firstColumn="1" w:firstRow="1" w:lastColumn="0" w:lastRow="0" w:noHBand="0" w:noVBand="1" w:val="04A0"/>
       </w:tblPr>
       <w:tblGrid>
-        <w:gridCol w:w="4320"/>
-        <w:gridCol w:w="4320"/>
+        <w:gridCol w:w="3969"/>
+        <w:gridCol w:w="5386"/>
       </w:tblGrid>
       <w:tr>
         <w:tc>
           <w:tcPr>
-            <w:tcW w:type="dxa" w:w="4320"/>
+            <w:tcW w:type="dxa" w:w="4677"/>
           </w:tcPr>
           <w:p>
             <w:pPr>
+              <w:spacing w:after="0"/>
               <w:jc w:val="center"/>
             </w:pPr>
             <w:r>
               <w:rPr>
+                <w:i w:val="0"/>
                 <w:sz w:val="24"/>
               </w:rPr>
               <w:t>TẬP ĐOÀN BƯU CHÍNH VIỄN THÔNG VIỆT NAM</w:t>
@@ -31,6 +34,7 @@
             <w:r>
               <w:rPr>
                 <w:b/>
+                <w:i w:val="0"/>
                 <w:sz w:val="26"/>
               </w:rPr>
               <w:t>VNPT TÂY NINH</w:t>
@@ -38,10 +42,12 @@
           </w:p>
           <w:p>
             <w:pPr>
+              <w:spacing w:after="0"/>
               <w:jc w:val="center"/>
             </w:pPr>
             <w:r>
               <w:rPr>
+                <w:i w:val="0"/>
                 <w:sz w:val="26"/>
               </w:rPr>
               <w:t>Số: {{SO_TO_TRINH}}</w:t>
@@ -50,15 +56,17 @@
         </w:tc>
         <w:tc>
           <w:tcPr>
-            <w:tcW w:type="dxa" w:w="4320"/>
+            <w:tcW w:type="dxa" w:w="4677"/>
           </w:tcPr>
           <w:p>
             <w:pPr>
+              <w:spacing w:after="0"/>
               <w:jc w:val="center"/>
             </w:pPr>
             <w:r>
               <w:rPr>
                 <w:b/>
+                <w:i w:val="0"/>
                 <w:sz w:val="26"/>
               </w:rPr>
               <w:t>CỘNG HÒA XÃ HỘI CHỦ NGHĨA VIỆT NAM</w:t>
@@ -67,6 +75,7 @@
             <w:r>
               <w:rPr>
                 <w:b/>
+                <w:i w:val="0"/>
                 <w:sz w:val="28"/>
                 <w:u w:val="single"/>
               </w:rPr>
@@ -75,10 +84,12 @@
           </w:p>
           <w:p>
             <w:pPr>
+              <w:spacing w:after="0"/>
               <w:jc w:val="center"/>
             </w:pPr>
             <w:r>
               <w:rPr>
+                <w:i w:val="0"/>
                 <w:sz w:val="26"/>
               </w:rPr>
               <w:t>{{NGAY_THANG}}</w:t>
@@ -90,11 +101,13 @@
     <w:p/>
     <w:p>
       <w:pPr>
+        <w:spacing w:after="0"/>
         <w:jc w:val="center"/>
       </w:pPr>
       <w:r>
         <w:rPr>
           <w:b/>
+          <w:i w:val="0"/>
           <w:sz w:val="32"/>
         </w:rPr>
         <w:t>TỜ TRÌNH</w:t>
@@ -102,24 +115,26 @@
     </w:p>
     <w:p>
       <w:pPr>
+        <w:spacing w:after="240"/>
         <w:jc w:val="center"/>
       </w:pPr>
       <w:r>
         <w:rPr>
           <w:b/>
+          <w:i w:val="0"/>
           <w:sz w:val="28"/>
         </w:rPr>
         <w:t>V/v: {{TIEU_DE}}</w:t>
       </w:r>
     </w:p>
-    <w:p/>
     <w:p>
       <w:pPr>
-        <w:jc w:val="center"/>
+        <w:jc w:val="both"/>
       </w:pPr>
       <w:r>
         <w:rPr>
           <w:b/>
+          <w:i w:val="0"/>
           <w:sz w:val="28"/>
         </w:rPr>
         <w:t xml:space="preserve">Kính gửi: </w:t>
@@ -127,23 +142,32 @@
       <w:r>
         <w:rPr>
           <w:b/>
+          <w:i w:val="0"/>
           <w:sz w:val="28"/>
         </w:rPr>
         <w:t>{{KINH_GUI}}</w:t>
       </w:r>
     </w:p>
-    <w:p/>
     <w:p>
+      <w:pPr>
+        <w:jc w:val="both"/>
+      </w:pPr>
       <w:r>
         <w:t>{{CAN_CU}}</w:t>
       </w:r>
     </w:p>
     <w:p>
+      <w:pPr>
+        <w:jc w:val="both"/>
+      </w:pPr>
       <w:r>
         <w:t>{{NOI_DUNG}}</w:t>
       </w:r>
     </w:p>
     <w:p>
+      <w:pPr>
+        <w:jc w:val="both"/>
+      </w:pPr>
       <w:r>
         <w:t>{{DE_XUAT}}</w:t>
       </w:r>
@@ -152,21 +176,27 @@
     <w:tbl>
       <w:tblPr>
         <w:tblW w:type="auto" w:w="0"/>
+        <w:tblLayout w:type="fixed"/>
         <w:tblLook w:firstColumn="1" w:firstRow="1" w:lastColumn="0" w:lastRow="0" w:noHBand="0" w:noVBand="1" w:val="04A0"/>
       </w:tblPr>
       <w:tblGrid>
-        <w:gridCol w:w="4320"/>
-        <w:gridCol w:w="4320"/>
+        <w:gridCol w:w="2835"/>
+        <w:gridCol w:w="2835"/>
+        <w:gridCol w:w="3685"/>
       </w:tblGrid>
       <w:tr>
         <w:tc>
           <w:tcPr>
-            <w:tcW w:type="dxa" w:w="4320"/>
+            <w:tcW w:type="dxa" w:w="3118"/>
           </w:tcPr>
           <w:p>
+            <w:pPr>
+              <w:spacing w:after="0"/>
+            </w:pPr>
             <w:r>
               <w:rPr>
                 <w:b/>
+                <w:i w:val="0"/>
                 <w:sz w:val="24"/>
               </w:rPr>
               <w:t>Nơi nhận:</w:t>
@@ -174,22 +204,29 @@
             </w:r>
             <w:r>
               <w:rPr>
+                <w:i w:val="0"/>
                 <w:sz w:val="22"/>
               </w:rPr>
               <w:t>{{NOI_NHAN}}</w:t>
             </w:r>
           </w:p>
+        </w:tc>
+        <w:tc>
+          <w:tcPr>
+            <w:tcW w:type="dxa" w:w="3118"/>
+          </w:tcPr>
           <w:p>
             <w:pPr>
+              <w:spacing w:after="0"/>
               <w:jc w:val="center"/>
             </w:pPr>
             <w:r>
               <w:rPr>
                 <w:b/>
+                <w:i w:val="0"/>
               </w:rPr>
+              <w:t>NGƯỜI LẬP</w:t>
               <w:br/>
-              <w:br/>
-              <w:t>NGƯỜI LẬP</w:t>
               <w:br/>
               <w:br/>
               <w:br/>
@@ -198,6 +235,7 @@
             <w:r>
               <w:rPr>
                 <w:b/>
+                <w:i w:val="0"/>
               </w:rPr>
               <w:t>{{NGUOI_LAP}}</w:t>
             </w:r>
@@ -205,17 +243,20 @@
         </w:tc>
         <w:tc>
           <w:tcPr>
-            <w:tcW w:type="dxa" w:w="4320"/>
+            <w:tcW w:type="dxa" w:w="3118"/>
           </w:tcPr>
           <w:p>
             <w:pPr>
+              <w:spacing w:after="0"/>
               <w:jc w:val="center"/>
             </w:pPr>
             <w:r>
               <w:rPr>
                 <w:b/>
+                <w:i w:val="0"/>
               </w:rPr>
               <w:t>NGƯỜI PHÊ DUYỆT</w:t>
+              <w:br/>
               <w:br/>
               <w:br/>
               <w:br/>
@@ -224,6 +265,7 @@
             <w:r>
               <w:rPr>
                 <w:b/>
+                <w:i w:val="0"/>
               </w:rPr>
               <w:t>{{NGUOI_KY}}</w:t>
             </w:r>
@@ -232,8 +274,8 @@
       </w:tr>
     </w:tbl>
     <w:sectPr>
-      <w:pgSz w:w="12240" w:h="15840"/>
-      <w:pgMar w:top="1440" w:right="1800" w:bottom="1440" w:left="1800" w:header="720" w:footer="720" w:gutter="0"/>
+      <w:pgSz w:w="11906" w:h="16838"/>
+      <w:pgMar w:top="1134" w:right="850" w:bottom="1134" w:left="1701" w:header="720" w:footer="720" w:gutter="0"/>
       <w:cols w:space="720"/>
       <w:docGrid w:linePitch="360"/>
     </w:sectPr>
@@ -604,9 +646,12 @@
     <w:name w:val="Normal"/>
     <w:qFormat/>
     <w:rsid w:val="00FC693F"/>
+    <w:pPr>
+      <w:spacing w:after="120"/>
+    </w:pPr>
     <w:rPr>
       <w:rFonts w:ascii="Times New Roman" w:hAnsi="Times New Roman"/>
-      <w:i/>
+      <w:i w:val="0"/>
       <w:sz w:val="28"/>
     </w:rPr>
   </w:style>

</xml_diff>